<commit_message>
Phase 2/4: risk concentration (Sigma_t, Ledoit-Wolf) build, collinearity checks, and incremental P-measure power tests
Adds the risk-concentration dimension (covariance_estimation.py,
risk_measures.py, build_risk_concentration_panel.py) with its
constant-correlation Ledoit-Wolf estimator, cross-dimension and internal
collinearity diagnostics (levels/differences, sub-periods), and the
Phase-4 incremental power check against the existing P-measure model.
Documents the external supervisory review (2026-08-24) on the CSI's
current one-dimension-vs-four-dimension gap, and updates the data
inventory: Bloomberg confirmed as the sole options source (no WRDS
OptionMetrics access), passive-flows pull marked done.

Co-Authored-By: Claude Sonnet 5 <noreply@anthropic.com>
Claude-Session: https://claude.ai/code/session_01VUtkPzaQzjUv3q8WQY14qQ
</commit_message>
<xml_diff>
--- a/Chapter One Introduction and Research Design.docx
+++ b/Chapter One Introduction and Research Design.docx
@@ -1473,7 +1473,20 @@
       </w:pPr>
       <w:r>
         <w:lastRenderedPageBreak/>
-        <w:t xml:space="preserve">Third, the dissertation provides evidence on how CSI conditions risk-neutral tails and premia in index options. The aim is to establish whether concentration shifts the risk-neutral distribution and whether this shift manifests primarily in left-tail objects that cannot be spanned by volatility, consistent with the tail-factor evidence from index option surfaces. </w:t>
+        <w:t xml:space="preserve">Third, the dissertation provides evidence on how CSI conditions risk-neutral tails and premia in index options. </w:t>
+      </w:r>
+      <w:commentRangeStart w:id="11"/>
+      <w:r>
+        <w:t xml:space="preserve">The aim is to establish whether concentration shifts the risk-neutral distribution and whether this shift manifests primarily in left-tail objects that cannot be spanned by volatility, consistent with the tail-factor evidence from index option surfaces. </w:t>
+      </w:r>
+      <w:commentRangeEnd w:id="11"/>
+      <w:r>
+        <w:rPr>
+          <w:rStyle w:val="CommentReference"/>
+          <w:sz w:val="24"/>
+          <w:szCs w:val="24"/>
+        </w:rPr>
+        <w:commentReference w:id="11"/>
       </w:r>
       <w:hyperlink r:id="rId30">
         <w:r>
@@ -1488,6 +1501,7 @@
       <w:pPr>
         <w:pStyle w:val="BodyText"/>
       </w:pPr>
+      <w:commentRangeStart w:id="12"/>
       <w:r>
         <w:t xml:space="preserve">A distinctive aspect of the dissertation’s positioning is its deliberate bridge across three literatures that are often treated separately. The granular hypothesis provides a mechanism linking concentration to aggregate fluctuations. </w:t>
       </w:r>
@@ -1557,33 +1571,6 @@
       <w:r>
         <w:t xml:space="preserve"> framework in which concentration is treated as a structural state variable that shapes both realized fragility and the pricing of crash states.</w:t>
       </w:r>
-    </w:p>
-    <w:p>
-      <w:pPr>
-        <w:pStyle w:val="BodyText"/>
-      </w:pPr>
-      <w:r>
-        <w:t>With these questions and contributions in place, the remainder of this chapter outlines the empirical design at a high level and provides a roadmap for the dissertation.</w:t>
-      </w:r>
-    </w:p>
-    <w:p>
-      <w:pPr>
-        <w:pStyle w:val="Heading2"/>
-      </w:pPr>
-      <w:bookmarkStart w:id="11" w:name="empirical-design-overview"/>
-      <w:bookmarkEnd w:id="10"/>
-      <w:r>
-        <w:t>Empirical Design Overview</w:t>
-      </w:r>
-    </w:p>
-    <w:p>
-      <w:pPr>
-        <w:pStyle w:val="FirstParagraph"/>
-      </w:pPr>
-      <w:commentRangeStart w:id="12"/>
-      <w:r>
-        <w:t xml:space="preserve">The empirical strategy is intentionally designed to be PhD-level rigorous yet interpretable, </w:t>
-      </w:r>
       <w:commentRangeEnd w:id="12"/>
       <w:r>
         <w:rPr>
@@ -1593,29 +1580,81 @@
         </w:rPr>
         <w:commentReference w:id="12"/>
       </w:r>
-      <w:r>
-        <w:t>aligning with two principles: limit model proliferation and focus on a small number of econometric blocks with clear roles. The dissertation uses two linked data environments: constituent-level equity data for the physical measure analysis and SPX option data for risk-neutral distribution and premium extraction.</w:t>
-      </w:r>
-    </w:p>
-    <w:p>
-      <w:pPr>
-        <w:pStyle w:val="BodyText"/>
-      </w:pPr>
-      <w:commentRangeStart w:id="13"/>
-      <w:r>
-        <w:t xml:space="preserve">The core market is the S&amp;P 500 and its constituents, with a sample intended to begin around the mid‑2000s and extend to the present. </w:t>
-      </w:r>
-      <w:commentRangeEnd w:id="13"/>
+    </w:p>
+    <w:p>
+      <w:pPr>
+        <w:pStyle w:val="BodyText"/>
+      </w:pPr>
+      <w:r>
+        <w:t>With these questions and contributions in place, the remainder of this chapter outlines the empirical design at a high level and provides a roadmap for the dissertation.</w:t>
+      </w:r>
+    </w:p>
+    <w:p>
+      <w:pPr>
+        <w:pStyle w:val="Heading2"/>
+      </w:pPr>
+      <w:bookmarkStart w:id="13" w:name="empirical-design-overview"/>
+      <w:bookmarkEnd w:id="10"/>
+      <w:r>
+        <w:t>Empirical Design Overview</w:t>
+      </w:r>
+    </w:p>
+    <w:p>
+      <w:pPr>
+        <w:pStyle w:val="FirstParagraph"/>
+      </w:pPr>
+      <w:commentRangeStart w:id="14"/>
+      <w:r>
+        <w:t xml:space="preserve">The empirical strategy is intentionally designed to be PhD-level rigorous yet interpretable, </w:t>
+      </w:r>
+      <w:commentRangeEnd w:id="14"/>
       <w:r>
         <w:rPr>
           <w:rStyle w:val="CommentReference"/>
           <w:sz w:val="24"/>
           <w:szCs w:val="24"/>
         </w:rPr>
-        <w:commentReference w:id="13"/>
-      </w:r>
-      <w:r>
-        <w:t xml:space="preserve">The choice of SPX index options is motivated by their institutional structure and liquidity: SPX options are widely used to manage large-cap U.S. equity exposure, and Cboe emphasizes features such as cash settlement and European-style exercise, which simplify the interpretation of prices as claims on index outcomes at expiration. </w:t>
+        <w:commentReference w:id="14"/>
+      </w:r>
+      <w:r>
+        <w:t>aligning with two principles: limit model proliferation and focus on a small number of econometric blocks with clear roles. The dissertation uses two linked data environments: constituent-level equity data for the physical measure analysis and SPX option data for risk-neutral distribution and premium extraction.</w:t>
+      </w:r>
+    </w:p>
+    <w:p>
+      <w:pPr>
+        <w:pStyle w:val="BodyText"/>
+      </w:pPr>
+      <w:commentRangeStart w:id="15"/>
+      <w:r>
+        <w:t xml:space="preserve">The core market is the S&amp;P 500 and its constituents, with a sample intended to begin around the mid‑2000s and extend to the present. </w:t>
+      </w:r>
+      <w:commentRangeEnd w:id="15"/>
+      <w:r>
+        <w:rPr>
+          <w:rStyle w:val="CommentReference"/>
+          <w:sz w:val="24"/>
+          <w:szCs w:val="24"/>
+        </w:rPr>
+        <w:commentReference w:id="15"/>
+      </w:r>
+      <w:r>
+        <w:t xml:space="preserve">The choice of SPX index options is motivated by their institutional structure and liquidity: SPX options are widely used to manage large-cap U.S. equity exposure, </w:t>
+      </w:r>
+      <w:commentRangeStart w:id="16"/>
+      <w:r>
+        <w:t xml:space="preserve">and Cboe emphasizes features such as </w:t>
+      </w:r>
+      <w:commentRangeEnd w:id="16"/>
+      <w:r>
+        <w:rPr>
+          <w:rStyle w:val="CommentReference"/>
+          <w:sz w:val="24"/>
+          <w:szCs w:val="24"/>
+        </w:rPr>
+        <w:commentReference w:id="16"/>
+      </w:r>
+      <w:r>
+        <w:t xml:space="preserve">cash settlement and European-style exercise, which simplify the interpretation of prices as claims on index outcomes at expiration. </w:t>
       </w:r>
       <w:hyperlink r:id="rId35">
         <w:r>
@@ -1626,7 +1665,23 @@
         </w:r>
       </w:hyperlink>
       <w:r>
-        <w:t xml:space="preserve"> On the data availability side, a leading empirical standard in academic work is to use end-of-day option datasets with long coverage; for example, OptionMetrics describes historical U.S. equity and index options coverage from 1996 onward, supporting the feasibility of a 2005–present design. </w:t>
+        <w:t xml:space="preserve"> </w:t>
+      </w:r>
+      <w:commentRangeStart w:id="17"/>
+      <w:r>
+        <w:t>On the data availability side, a leading empirical standard in academic work is to use end-of-day option datasets with long coverage; for example, OptionMetrics describes historical U.S. equity and index options coverage from 1996 onward, supporting the feasibility of a 2005–present design</w:t>
+      </w:r>
+      <w:commentRangeEnd w:id="17"/>
+      <w:r>
+        <w:rPr>
+          <w:rStyle w:val="CommentReference"/>
+          <w:sz w:val="24"/>
+          <w:szCs w:val="24"/>
+        </w:rPr>
+        <w:commentReference w:id="17"/>
+      </w:r>
+      <w:r>
+        <w:t xml:space="preserve">. </w:t>
       </w:r>
       <w:hyperlink r:id="rId36">
         <w:r>
@@ -1683,8 +1738,21 @@
       <w:pPr>
         <w:pStyle w:val="BodyText"/>
       </w:pPr>
-      <w:r>
-        <w:t xml:space="preserve">In the physical-measure block, the dissertation focuses on realized systemic risk measures such as downside outcomes, drawdowns, and correlation spikes. The econometric toolkit is deliberately compact. First, realized-risk dynamics are modeled using HAR-style specifications, which were developed to approximate long-memory volatility dynamics in a parsimonious and tractable way. </w:t>
+      <w:commentRangeStart w:id="18"/>
+      <w:r>
+        <w:t>In the physical-measure block, the dissertation focuses on realized systemic risk measures such as downside outcomes, drawdowns, and correlation spikes</w:t>
+      </w:r>
+      <w:commentRangeEnd w:id="18"/>
+      <w:r>
+        <w:rPr>
+          <w:rStyle w:val="CommentReference"/>
+          <w:sz w:val="24"/>
+          <w:szCs w:val="24"/>
+        </w:rPr>
+        <w:commentReference w:id="18"/>
+      </w:r>
+      <w:r>
+        <w:t xml:space="preserve">. The econometric toolkit is deliberately compact. First, realized-risk dynamics are modeled using HAR-style specifications, which were developed to approximate long-memory volatility dynamics in a parsimonious and tractable way. </w:t>
       </w:r>
       <w:hyperlink r:id="rId38">
         <w:r>
@@ -1774,7 +1842,39 @@
         <w:pStyle w:val="BodyText"/>
       </w:pPr>
       <w:r>
-        <w:t xml:space="preserve">The remainder of the dissertation develops this design as follows. Chapter Two provides a structured review and synthesis across the concentration/granular, systemic risk, and option-implied premium literatures, sharpening the gap and positioning. Chapter Three formalizes measurement and constructs CSI, documenting robustness and dimensionality. Chapter Four delivers the econometric evidence in the physical measure, using HAR-style dynamics, quantile regressions, and local projections to characterize concentration as a state variable for realized systemic fragility. Chapter Five develops the option-based analysis, extracting risk-neutral moments and tail measures from SPX option panels and linking them to CSI, VRP, and tail-premium-like components. Chapter Six integrates the </w:t>
+        <w:t xml:space="preserve">The remainder of the dissertation develops this design as follows. Chapter Two provides a structured review and synthesis across the concentration/granular, systemic risk, and option-implied premium literatures, </w:t>
+      </w:r>
+      <w:commentRangeStart w:id="19"/>
+      <w:r>
+        <w:t>sharpening the gap and positioning</w:t>
+      </w:r>
+      <w:commentRangeEnd w:id="19"/>
+      <w:r>
+        <w:rPr>
+          <w:rStyle w:val="CommentReference"/>
+          <w:sz w:val="24"/>
+          <w:szCs w:val="24"/>
+        </w:rPr>
+        <w:commentReference w:id="19"/>
+      </w:r>
+      <w:r>
+        <w:t xml:space="preserve">. Chapter Three formalizes measurement and constructs CSI, documenting robustness and dimensionality. Chapter Four delivers the econometric evidence in the physical measure, </w:t>
+      </w:r>
+      <w:commentRangeStart w:id="20"/>
+      <w:r>
+        <w:t>using HAR-style dynamics, quantile regressions, and local projections</w:t>
+      </w:r>
+      <w:commentRangeEnd w:id="20"/>
+      <w:r>
+        <w:rPr>
+          <w:rStyle w:val="CommentReference"/>
+          <w:sz w:val="24"/>
+          <w:szCs w:val="24"/>
+        </w:rPr>
+        <w:commentReference w:id="20"/>
+      </w:r>
+      <w:r>
+        <w:t xml:space="preserve"> to characterize concentration as a state variable for realized systemic fragility. Chapter Five develops the option-based analysis, extracting risk-neutral moments and tail measures from SPX option panels and linking them to CSI, VRP, and tail-premium-like components. Chapter Six integrates the </w:t>
       </w:r>
       <m:oMath>
         <m:r>
@@ -1810,7 +1910,7 @@
     </w:p>
     <w:bookmarkEnd w:id="1"/>
     <w:bookmarkEnd w:id="2"/>
-    <w:bookmarkEnd w:id="11"/>
+    <w:bookmarkEnd w:id="13"/>
     <w:p/>
     <w:p>
       <w:r>
@@ -1823,7 +1923,7 @@
       <w:pPr>
         <w:pStyle w:val="FirstParagraph"/>
       </w:pPr>
-      <w:bookmarkStart w:id="14" w:name="citations"/>
+      <w:bookmarkStart w:id="21" w:name="citations"/>
     </w:p>
     <w:p>
       <w:pPr>
@@ -2409,7 +2509,7 @@
           <w:t>https://www.aeaweb.org/articles?id=10.1257%2F0002828053828518&amp;utm_source=chatgpt.com</w:t>
         </w:r>
       </w:hyperlink>
-      <w:bookmarkEnd w:id="14"/>
+      <w:bookmarkEnd w:id="21"/>
     </w:p>
     <w:sectPr>
       <w:footnotePr>
@@ -2505,7 +2605,7 @@
       </w:r>
     </w:p>
   </w:comment>
-  <w:comment w:id="12" w:author="rebecca benassi" w:date="2026-04-30T16:06:00Z" w:initials="rb">
+  <w:comment w:id="11" w:author="rebecca benassi" w:date="2026-07-15T11:03:00Z" w:initials="rb">
     <w:p>
       <w:pPr>
         <w:pStyle w:val="CommentText"/>
@@ -2517,11 +2617,49 @@
         <w:annotationRef/>
       </w:r>
       <w:r>
+        <w:rPr>
+          <w:lang w:val="it-IT"/>
+        </w:rPr>
+        <w:t>Detto 80 volte</w:t>
+      </w:r>
+    </w:p>
+  </w:comment>
+  <w:comment w:id="12" w:author="rebecca benassi" w:date="2026-07-15T11:03:00Z" w:initials="rb">
+    <w:p>
+      <w:pPr>
+        <w:pStyle w:val="CommentText"/>
+      </w:pPr>
+      <w:r>
+        <w:rPr>
+          <w:rStyle w:val="CommentReference"/>
+        </w:rPr>
+        <w:annotationRef/>
+      </w:r>
+      <w:r>
+        <w:rPr>
+          <w:lang w:val="it-IT"/>
+        </w:rPr>
+        <w:t>Troppo presuntuoso</w:t>
+      </w:r>
+    </w:p>
+  </w:comment>
+  <w:comment w:id="14" w:author="rebecca benassi" w:date="2026-04-30T16:06:00Z" w:initials="rb">
+    <w:p>
+      <w:pPr>
+        <w:pStyle w:val="CommentText"/>
+      </w:pPr>
+      <w:r>
+        <w:rPr>
+          <w:rStyle w:val="CommentReference"/>
+        </w:rPr>
+        <w:annotationRef/>
+      </w:r>
+      <w:r>
         <w:t>Eliminare/cambiare</w:t>
       </w:r>
     </w:p>
   </w:comment>
-  <w:comment w:id="13" w:author="rebecca benassi" w:date="2026-04-30T16:07:00Z" w:initials="rb">
+  <w:comment w:id="15" w:author="rebecca benassi" w:date="2026-04-30T16:07:00Z" w:initials="rb">
     <w:p>
       <w:pPr>
         <w:pStyle w:val="CommentText"/>
@@ -2534,6 +2672,101 @@
       </w:r>
       <w:r>
         <w:t>TBD</w:t>
+      </w:r>
+    </w:p>
+  </w:comment>
+  <w:comment w:id="16" w:author="rebecca benassi" w:date="2026-07-15T11:04:00Z" w:initials="rb">
+    <w:p>
+      <w:pPr>
+        <w:pStyle w:val="CommentText"/>
+      </w:pPr>
+      <w:r>
+        <w:rPr>
+          <w:rStyle w:val="CommentReference"/>
+        </w:rPr>
+        <w:annotationRef/>
+      </w:r>
+      <w:r>
+        <w:rPr>
+          <w:lang w:val="it-IT"/>
+        </w:rPr>
+        <w:t>Togliere?</w:t>
+      </w:r>
+    </w:p>
+  </w:comment>
+  <w:comment w:id="17" w:author="rebecca benassi" w:date="2026-07-15T11:05:00Z" w:initials="rb">
+    <w:p>
+      <w:pPr>
+        <w:pStyle w:val="CommentText"/>
+      </w:pPr>
+      <w:r>
+        <w:rPr>
+          <w:rStyle w:val="CommentReference"/>
+        </w:rPr>
+        <w:annotationRef/>
+      </w:r>
+      <w:r>
+        <w:rPr>
+          <w:lang w:val="it-IT"/>
+        </w:rPr>
+        <w:t>cambiare</w:t>
+      </w:r>
+    </w:p>
+  </w:comment>
+  <w:comment w:id="18" w:author="rebecca benassi" w:date="2026-07-15T11:06:00Z" w:initials="rb">
+    <w:p>
+      <w:pPr>
+        <w:pStyle w:val="CommentText"/>
+      </w:pPr>
+      <w:r>
+        <w:rPr>
+          <w:rStyle w:val="CommentReference"/>
+        </w:rPr>
+        <w:annotationRef/>
+      </w:r>
+      <w:r>
+        <w:rPr>
+          <w:lang w:val="it-IT"/>
+        </w:rPr>
+        <w:t>Già detto</w:t>
+      </w:r>
+    </w:p>
+  </w:comment>
+  <w:comment w:id="19" w:author="rebecca benassi" w:date="2026-07-15T11:08:00Z" w:initials="rb">
+    <w:p>
+      <w:pPr>
+        <w:pStyle w:val="CommentText"/>
+      </w:pPr>
+      <w:r>
+        <w:rPr>
+          <w:rStyle w:val="CommentReference"/>
+        </w:rPr>
+        <w:annotationRef/>
+      </w:r>
+      <w:r>
+        <w:rPr>
+          <w:lang w:val="it-IT"/>
+        </w:rPr>
+        <w:t>Troppo presuntuoso</w:t>
+      </w:r>
+    </w:p>
+  </w:comment>
+  <w:comment w:id="20" w:author="rebecca benassi" w:date="2026-07-15T11:09:00Z" w:initials="rb">
+    <w:p>
+      <w:pPr>
+        <w:pStyle w:val="CommentText"/>
+      </w:pPr>
+      <w:r>
+        <w:rPr>
+          <w:rStyle w:val="CommentReference"/>
+        </w:rPr>
+        <w:annotationRef/>
+      </w:r>
+      <w:r>
+        <w:rPr>
+          <w:lang w:val="it-IT"/>
+        </w:rPr>
+        <w:t>Già detto</w:t>
       </w:r>
     </w:p>
   </w:comment>
@@ -2546,8 +2779,15 @@
   <w15:commentEx w15:paraId="277CAFAC" w15:done="0"/>
   <w15:commentEx w15:paraId="45E3DB4E" w15:done="0"/>
   <w15:commentEx w15:paraId="2DE33BB4" w15:done="0"/>
+  <w15:commentEx w15:paraId="05E7B3F4" w15:done="0"/>
+  <w15:commentEx w15:paraId="257C752C" w15:done="0"/>
   <w15:commentEx w15:paraId="23E21183" w15:done="0"/>
   <w15:commentEx w15:paraId="52FD3F91" w15:done="0"/>
+  <w15:commentEx w15:paraId="148DADFC" w15:done="0"/>
+  <w15:commentEx w15:paraId="4FC3F047" w15:done="0"/>
+  <w15:commentEx w15:paraId="26083313" w15:done="0"/>
+  <w15:commentEx w15:paraId="1B1C4B8F" w15:done="0"/>
+  <w15:commentEx w15:paraId="40E8BA48" w15:done="0"/>
 </w15:commentsEx>
 </file>
 
@@ -2557,8 +2797,15 @@
   <w16cex:commentExtensible w16cex:durableId="5C2C0F99" w16cex:dateUtc="2026-06-19T13:32:00Z"/>
   <w16cex:commentExtensible w16cex:durableId="5836E382" w16cex:dateUtc="2026-04-12T15:11:00Z"/>
   <w16cex:commentExtensible w16cex:durableId="0DA083C0" w16cex:dateUtc="2026-04-29T09:01:00Z"/>
+  <w16cex:commentExtensible w16cex:durableId="268F376F" w16cex:dateUtc="2026-07-15T09:03:00Z"/>
+  <w16cex:commentExtensible w16cex:durableId="6D42385C" w16cex:dateUtc="2026-07-15T09:03:00Z"/>
   <w16cex:commentExtensible w16cex:durableId="0837C144" w16cex:dateUtc="2026-04-30T14:06:00Z"/>
   <w16cex:commentExtensible w16cex:durableId="2CF42649" w16cex:dateUtc="2026-04-30T14:07:00Z"/>
+  <w16cex:commentExtensible w16cex:durableId="48E8605E" w16cex:dateUtc="2026-07-15T09:04:00Z"/>
+  <w16cex:commentExtensible w16cex:durableId="2904B4F3" w16cex:dateUtc="2026-07-15T09:05:00Z"/>
+  <w16cex:commentExtensible w16cex:durableId="0FF02313" w16cex:dateUtc="2026-07-15T09:06:00Z"/>
+  <w16cex:commentExtensible w16cex:durableId="6F894590" w16cex:dateUtc="2026-07-15T09:08:00Z"/>
+  <w16cex:commentExtensible w16cex:durableId="6C42E7E9" w16cex:dateUtc="2026-07-15T09:09:00Z"/>
 </w16cex:commentsExtensible>
 </file>
 
@@ -2568,8 +2815,15 @@
   <w16cid:commentId w16cid:paraId="277CAFAC" w16cid:durableId="5C2C0F99"/>
   <w16cid:commentId w16cid:paraId="45E3DB4E" w16cid:durableId="5836E382"/>
   <w16cid:commentId w16cid:paraId="2DE33BB4" w16cid:durableId="0DA083C0"/>
+  <w16cid:commentId w16cid:paraId="05E7B3F4" w16cid:durableId="268F376F"/>
+  <w16cid:commentId w16cid:paraId="257C752C" w16cid:durableId="6D42385C"/>
   <w16cid:commentId w16cid:paraId="23E21183" w16cid:durableId="0837C144"/>
   <w16cid:commentId w16cid:paraId="52FD3F91" w16cid:durableId="2CF42649"/>
+  <w16cid:commentId w16cid:paraId="148DADFC" w16cid:durableId="48E8605E"/>
+  <w16cid:commentId w16cid:paraId="4FC3F047" w16cid:durableId="2904B4F3"/>
+  <w16cid:commentId w16cid:paraId="26083313" w16cid:durableId="0FF02313"/>
+  <w16cid:commentId w16cid:paraId="1B1C4B8F" w16cid:durableId="6F894590"/>
+  <w16cid:commentId w16cid:paraId="40E8BA48" w16cid:durableId="6C42E7E9"/>
 </w16cid:commentsIds>
 </file>
 

</xml_diff>